<commit_message>
Historial de prompts (DOCX) al día
Co-Authored-By: Claude Opus 5.5 <noreply@anthropic.com>
</commit_message>
<xml_diff>
--- a/docs/Historial_de_prompts_TransferdeLuxe.docx
+++ b/docs/Historial_de_prompts_TransferdeLuxe.docx
@@ -31,7 +31,7 @@
         <w:pStyle w:val="ListBullet"/>
       </w:pPr>
       <w:r>
-        <w:t>Plataforma de desarrollo: Claude Code (única IA de desarrollo usada; modelo Claude Opus). 235 prompts entre el 09/10 y el 17/10/2026, en 1 sesión de Claude Code (continuada con resúmenes automáticos de contexto).</w:t>
+        <w:t>Plataforma de desarrollo: Claude Code (única IA de desarrollo usada; modelo Claude Opus). 272 prompts entre el 09/10 y el 19/10/2026, en 1 sesión de Claude Code (continuada con resúmenes automáticos de contexto).</w:t>
       </w:r>
     </w:p>
     <w:p>
@@ -299,7 +299,51 @@
           </w:tcPr>
           <w:p>
             <w:r>
-              <w:t>14</w:t>
+              <w:t>22</w:t>
+            </w:r>
+          </w:p>
+        </w:tc>
+      </w:tr>
+      <w:tr>
+        <w:tc>
+          <w:tcPr>
+            <w:tcW w:type="dxa" w:w="4873"/>
+          </w:tcPr>
+          <w:p>
+            <w:r>
+              <w:t>domingo 18 de octubre</w:t>
+            </w:r>
+          </w:p>
+        </w:tc>
+        <w:tc>
+          <w:tcPr>
+            <w:tcW w:type="dxa" w:w="4873"/>
+          </w:tcPr>
+          <w:p>
+            <w:r>
+              <w:t>26</w:t>
+            </w:r>
+          </w:p>
+        </w:tc>
+      </w:tr>
+      <w:tr>
+        <w:tc>
+          <w:tcPr>
+            <w:tcW w:type="dxa" w:w="4873"/>
+          </w:tcPr>
+          <w:p>
+            <w:r>
+              <w:t>lunes 19 de octubre</w:t>
+            </w:r>
+          </w:p>
+        </w:tc>
+        <w:tc>
+          <w:tcPr>
+            <w:tcW w:type="dxa" w:w="4873"/>
+          </w:tcPr>
+          <w:p>
+            <w:r>
+              <w:t>3</w:t>
             </w:r>
           </w:p>
         </w:tc>
@@ -321,7 +365,7 @@
           </w:tcPr>
           <w:p>
             <w:r>
-              <w:t>235</w:t>
+              <w:t>272</w:t>
             </w:r>
           </w:p>
         </w:tc>
@@ -7238,6 +7282,896 @@
       </w:pPr>
       <w:r>
         <w:t>Si estoy rellenando un formulario y le doy al botón de política de privacidad, me las muestra, pero no tengo un botón para volver. Entonces, al volver para atrás, se me ha borrado el formulario y tengo que volver a empezar. ¿Puedes solucionar eso? ¿O poner un botón de volver y que no se borre el formulario que hemos creado?</w:t>
+      </w:r>
+    </w:p>
+    <w:p>
+      <w:pPr>
+        <w:keepNext/>
+        <w:spacing w:before="200"/>
+      </w:pPr>
+      <w:r>
+        <w:rPr>
+          <w:b/>
+          <w:color w:val="1F4E79"/>
+        </w:rPr>
+        <w:t>#236 · 19:54 · Claude Code · sesión b3c0e64f</w:t>
+      </w:r>
+    </w:p>
+    <w:p>
+      <w:pPr>
+        <w:spacing w:after="40"/>
+        <w:ind w:left="227"/>
+      </w:pPr>
+      <w:r>
+        <w:t>Las indicaciones de gira a la derecha y, y este estilo, quítalas, no, no las muestres.</w:t>
+      </w:r>
+    </w:p>
+    <w:p>
+      <w:pPr>
+        <w:keepNext/>
+        <w:spacing w:before="200"/>
+      </w:pPr>
+      <w:r>
+        <w:rPr>
+          <w:b/>
+          <w:color w:val="1F4E79"/>
+        </w:rPr>
+        <w:t>#237 · 20:00 · Claude Code · sesión b3c0e64f</w:t>
+      </w:r>
+    </w:p>
+    <w:p>
+      <w:pPr>
+        <w:spacing w:after="40"/>
+        <w:ind w:left="227"/>
+      </w:pPr>
+      <w:r>
+        <w:t>Este es un servicio que está asignado a un conductor pero yo desde el centro de control tendría que poder cancelarlo o moverlo. Y me dice que no puede porque está en curso. Eh, puedes rectificar eso, el centro de control tiene que tener acceso a todas las opciones y poder cancelar portes, moverlos, cambiarlos de hora, todas las funciones. ¿Vale? Por si el chofer no responde y no tenemos ningún contacto con él, pues ese servicio poderlo reasignar desde el centro de control. ¿Vale? No se pueden quedar en espera de entrega.</w:t>
+      </w:r>
+    </w:p>
+    <w:p>
+      <w:pPr>
+        <w:keepNext/>
+        <w:spacing w:before="200"/>
+      </w:pPr>
+      <w:r>
+        <w:rPr>
+          <w:b/>
+          <w:color w:val="1F4E79"/>
+        </w:rPr>
+        <w:t>#238 · 20:55 · Claude Code · sesión b3c0e64f</w:t>
+      </w:r>
+    </w:p>
+    <w:p>
+      <w:pPr>
+        <w:spacing w:after="40"/>
+        <w:ind w:left="227"/>
+      </w:pPr>
+      <w:r>
+        <w:t>Has pensado cómo grabar el vídeo para el concurso? Has valorado mostrar cómo funciona todo desde la central, página web y aplicaciones de los conductores?</w:t>
+      </w:r>
+    </w:p>
+    <w:p>
+      <w:pPr>
+        <w:keepNext/>
+        <w:spacing w:before="200"/>
+      </w:pPr>
+      <w:r>
+        <w:rPr>
+          <w:b/>
+          <w:color w:val="1F4E79"/>
+        </w:rPr>
+        <w:t>#239 · 20:59 · Claude Code · sesión b3c0e64f</w:t>
+      </w:r>
+    </w:p>
+    <w:p>
+      <w:pPr>
+        <w:spacing w:after="40"/>
+        <w:ind w:left="227"/>
+      </w:pPr>
+      <w:r>
+        <w:t>Si actualiza. Puedes grabar tu la voz en off en castellano. Pero intenta no usar un español con acento inglés que lo odio!</w:t>
+      </w:r>
+    </w:p>
+    <w:p>
+      <w:pPr>
+        <w:keepNext/>
+        <w:spacing w:before="200"/>
+      </w:pPr>
+      <w:r>
+        <w:rPr>
+          <w:b/>
+          <w:color w:val="1F4E79"/>
+        </w:rPr>
+        <w:t>#240 · 21:04 · Claude Code · sesión b3c0e64f</w:t>
+      </w:r>
+    </w:p>
+    <w:p>
+      <w:pPr>
+        <w:spacing w:after="40"/>
+        <w:ind w:left="227"/>
+      </w:pPr>
+      <w:r>
+        <w:t>Vamos a hacer una revisión final de funcionamiento. Te he subido el</w:t>
+      </w:r>
+    </w:p>
+    <w:p>
+      <w:pPr>
+        <w:spacing w:after="40"/>
+        <w:ind w:left="227"/>
+      </w:pPr>
+      <w:r>
+        <w:t>Nivel de esfuerzo para que detectes fallos y mejoras de rendimiento. Estresa las aplicaciones para detectar límites. Si por el camino detectas mejoras u optimizaciones me lo comentas</w:t>
+      </w:r>
+    </w:p>
+    <w:p>
+      <w:pPr>
+        <w:keepNext/>
+        <w:spacing w:before="200"/>
+      </w:pPr>
+      <w:r>
+        <w:rPr>
+          <w:b/>
+          <w:color w:val="1F4E79"/>
+        </w:rPr>
+        <w:t>#241 · 22:17 · Claude Code · sesión b3c0e64f</w:t>
+      </w:r>
+    </w:p>
+    <w:p>
+      <w:pPr>
+        <w:spacing w:after="40"/>
+        <w:ind w:left="227"/>
+      </w:pPr>
+      <w:r>
+        <w:t>Oye puedes crear una opción de finalizar y empezar las jornadas de los conductores?</w:t>
+      </w:r>
+    </w:p>
+    <w:p>
+      <w:pPr>
+        <w:keepNext/>
+        <w:spacing w:before="200"/>
+      </w:pPr>
+      <w:r>
+        <w:rPr>
+          <w:b/>
+          <w:color w:val="1F4E79"/>
+        </w:rPr>
+        <w:t>#242 · 22:50 · Claude Code · sesión b3c0e64f</w:t>
+      </w:r>
+    </w:p>
+    <w:p>
+      <w:pPr>
+        <w:spacing w:after="40"/>
+        <w:ind w:left="227"/>
+      </w:pPr>
+      <w:r>
+        <w:t>Da de baja el usuario [responsable]</w:t>
+      </w:r>
+    </w:p>
+    <w:p>
+      <w:pPr>
+        <w:keepNext/>
+        <w:spacing w:before="200"/>
+      </w:pPr>
+      <w:r>
+        <w:rPr>
+          <w:b/>
+          <w:color w:val="1F4E79"/>
+        </w:rPr>
+        <w:t>#243 · 22:51 · Claude Code · sesión b3c0e64f</w:t>
+      </w:r>
+    </w:p>
+    <w:p>
+      <w:pPr>
+        <w:spacing w:after="40"/>
+        <w:ind w:left="227"/>
+      </w:pPr>
+      <w:r>
+        <w:t>Si</w:t>
+      </w:r>
+    </w:p>
+    <w:p>
+      <w:r>
+        <w:br w:type="page"/>
+      </w:r>
+    </w:p>
+    <w:p>
+      <w:pPr>
+        <w:pStyle w:val="Heading1"/>
+      </w:pPr>
+      <w:r>
+        <w:t>Domingo 18 de octubre de 2026</w:t>
+      </w:r>
+    </w:p>
+    <w:p>
+      <w:pPr>
+        <w:keepNext/>
+        <w:spacing w:before="200"/>
+      </w:pPr>
+      <w:r>
+        <w:rPr>
+          <w:b/>
+          <w:color w:val="1F4E79"/>
+        </w:rPr>
+        <w:t>#244 · 11:48 · Claude Code · sesión b3c0e64f</w:t>
+      </w:r>
+    </w:p>
+    <w:p>
+      <w:pPr>
+        <w:spacing w:after="40"/>
+        <w:ind w:left="227"/>
+      </w:pPr>
+      <w:r>
+        <w:t>Buenos días, ya nos queda poco para presentarlo. Un vistazo final de que todo está ok y empezamos a preparar los vídeos.</w:t>
+      </w:r>
+    </w:p>
+    <w:p>
+      <w:pPr>
+        <w:keepNext/>
+        <w:spacing w:before="200"/>
+      </w:pPr>
+      <w:r>
+        <w:rPr>
+          <w:b/>
+          <w:color w:val="1F4E79"/>
+        </w:rPr>
+        <w:t>#245 · 12:07 · Claude Code · sesión b3c0e64f</w:t>
+      </w:r>
+    </w:p>
+    <w:p>
+      <w:pPr>
+        <w:spacing w:after="40"/>
+        <w:ind w:left="227"/>
+      </w:pPr>
+      <w:r>
+        <w:t>Vale, he parado los servicios abiertos, pero piensa que esto lo presentamos el día 19. No quiere decir que el día 19 lo mire nadie, y posiblemente durante la semana irán mirando. Eh, servicios que tengamos para esta fecha saldrán como caducados. No sé si vale la pena limpiar todo, ya que es una demo, no tenemos necesidad de tener servicios atrasados, o eh, cambiar las fechas de los servicios actuales para que se ejecuten durante la semana y estén previsto de, de recogidas. Para que no hayan servicios caducados en la aplicación. No sé cómo lo ves. ¿Qué opinas?</w:t>
+      </w:r>
+    </w:p>
+    <w:p>
+      <w:pPr>
+        <w:keepNext/>
+        <w:spacing w:before="200"/>
+      </w:pPr>
+      <w:r>
+        <w:rPr>
+          <w:b/>
+          <w:color w:val="1F4E79"/>
+        </w:rPr>
+        <w:t>#246 · 12:17 · Claude Code · sesión b3c0e64f</w:t>
+      </w:r>
+    </w:p>
+    <w:p>
+      <w:pPr>
+        <w:spacing w:after="40"/>
+        <w:ind w:left="227"/>
+      </w:pPr>
+      <w:r>
+        <w:t>Sí, me parece perfecto lo que has decidido. Eh, que los conductores, pues que funcionen como funcionaría un humano, ¿no? Que viene, ficha, trabaja, mueve a la gente y cuando ya ha pasado su turno, se desficha y presenta el informe del coche y, y más o menos la empresa tendría que tener cubierto todo, la, todo el rango horario eh, con sus conductores y recuerda que si alguien quiere reservar en un momento en que los conductores están ocupados, pues ofrecerle otro slot de tiempo o el contacto con central para que le asignen de forma manual un, un sitio libre, ¿vale? Eh, tienes libertad para eliminar todas las, demos que hemos hecho, todos los servicios que hayan activos o, o sin activar, para que esto quede limpio lo construyes como tú crees que se debería presentar una demo y si lo dejas funcionando durante la semana, pues cuando accedan pues que vean que está vivo y que hay movimiento, que es una demo intenta interpretar cómo sería en el mundo real la, la situación.</w:t>
+      </w:r>
+    </w:p>
+    <w:p>
+      <w:pPr>
+        <w:keepNext/>
+        <w:spacing w:before="200"/>
+      </w:pPr>
+      <w:r>
+        <w:rPr>
+          <w:b/>
+          <w:color w:val="1F4E79"/>
+        </w:rPr>
+        <w:t>#247 · 13:00 · Claude Code · sesión b3c0e64f</w:t>
+      </w:r>
+    </w:p>
+    <w:p>
+      <w:pPr>
+        <w:spacing w:after="40"/>
+        <w:ind w:left="227"/>
+      </w:pPr>
+      <w:r>
+        <w:t>Vale, empezamos con los vídeos</w:t>
+      </w:r>
+    </w:p>
+    <w:p>
+      <w:pPr>
+        <w:keepNext/>
+        <w:spacing w:before="200"/>
+      </w:pPr>
+      <w:r>
+        <w:rPr>
+          <w:b/>
+          <w:color w:val="1F4E79"/>
+        </w:rPr>
+        <w:t>#248 · 13:01 · Claude Code · sesión b3c0e64f</w:t>
+      </w:r>
+    </w:p>
+    <w:p>
+      <w:pPr>
+        <w:spacing w:after="40"/>
+        <w:ind w:left="227"/>
+      </w:pPr>
+      <w:r>
+        <w:t>te he dejado mi iphone conectado por si lo necesitas</w:t>
+      </w:r>
+    </w:p>
+    <w:p>
+      <w:pPr>
+        <w:keepNext/>
+        <w:spacing w:before="200"/>
+      </w:pPr>
+      <w:r>
+        <w:rPr>
+          <w:b/>
+          <w:color w:val="1F4E79"/>
+        </w:rPr>
+        <w:t>#249 · 13:02 · Claude Code · sesión b3c0e64f</w:t>
+      </w:r>
+    </w:p>
+    <w:p>
+      <w:pPr>
+        <w:spacing w:after="40"/>
+        <w:ind w:left="227"/>
+      </w:pPr>
+      <w:r>
+        <w:t>haz tu los puntos de la preparacion</w:t>
+      </w:r>
+    </w:p>
+    <w:p>
+      <w:pPr>
+        <w:keepNext/>
+        <w:spacing w:before="200"/>
+      </w:pPr>
+      <w:r>
+        <w:rPr>
+          <w:b/>
+          <w:color w:val="1F4E79"/>
+        </w:rPr>
+        <w:t>#250 · 13:09 · Claude Code · sesión b3c0e64f</w:t>
+      </w:r>
+    </w:p>
+    <w:p>
+      <w:pPr>
+        <w:spacing w:after="40"/>
+        <w:ind w:left="227"/>
+      </w:pPr>
+      <w:r>
+        <w:t>recuerda que tengo 3 pantallas. seleccionado iphone en quicktime, no puedo seleccionar microfono ninguno. No tengo menu desarrollador en iphone</w:t>
+      </w:r>
+    </w:p>
+    <w:p>
+      <w:pPr>
+        <w:keepNext/>
+        <w:spacing w:before="200"/>
+      </w:pPr>
+      <w:r>
+        <w:rPr>
+          <w:b/>
+          <w:color w:val="1F4E79"/>
+        </w:rPr>
+        <w:t>#251 · 13:13 · Claude Code · sesión b3c0e64f</w:t>
+      </w:r>
+    </w:p>
+    <w:p>
+      <w:pPr>
+        <w:spacing w:after="40"/>
+        <w:ind w:left="227"/>
+      </w:pPr>
+      <w:r>
+        <w:t>He cerrado todas las ventanas y todas las aplicaciones para que no tengas interferencias. También he cerrado Chrome, ¿vale?</w:t>
+      </w:r>
+    </w:p>
+    <w:p>
+      <w:pPr>
+        <w:keepNext/>
+        <w:spacing w:before="200"/>
+      </w:pPr>
+      <w:r>
+        <w:rPr>
+          <w:b/>
+          <w:color w:val="1F4E79"/>
+        </w:rPr>
+        <w:t>#252 · 13:16 · Claude Code · sesión b3c0e64f</w:t>
+      </w:r>
+    </w:p>
+    <w:p>
+      <w:pPr>
+        <w:spacing w:after="40"/>
+        <w:ind w:left="227"/>
+      </w:pPr>
+      <w:r>
+        <w:t>Prueba ahora que te he cambiado la cámara a la pantalla del iPhone.</w:t>
+      </w:r>
+    </w:p>
+    <w:p>
+      <w:pPr>
+        <w:keepNext/>
+        <w:spacing w:before="200"/>
+      </w:pPr>
+      <w:r>
+        <w:rPr>
+          <w:b/>
+          <w:color w:val="1F4E79"/>
+        </w:rPr>
+        <w:t>#253 · 13:18 · Claude Code · sesión b3c0e64f</w:t>
+      </w:r>
+    </w:p>
+    <w:p>
+      <w:pPr>
+        <w:spacing w:after="40"/>
+        <w:ind w:left="227"/>
+      </w:pPr>
+      <w:r>
+        <w:t>Oye, veo que no nos aclaramos. ¿Qué te parece si utilizas el emulador de, de iPhone de los Xcode que tenemos instalado?</w:t>
+      </w:r>
+    </w:p>
+    <w:p>
+      <w:pPr>
+        <w:keepNext/>
+        <w:spacing w:before="200"/>
+      </w:pPr>
+      <w:r>
+        <w:rPr>
+          <w:b/>
+          <w:color w:val="1F4E79"/>
+        </w:rPr>
+        <w:t>#254 · 13:57 · Claude Code · sesión b3c0e64f</w:t>
+      </w:r>
+    </w:p>
+    <w:p>
+      <w:pPr>
+        <w:spacing w:after="40"/>
+        <w:ind w:left="227"/>
+      </w:pPr>
+      <w:r>
+        <w:t>ok</w:t>
+      </w:r>
+    </w:p>
+    <w:p>
+      <w:pPr>
+        <w:keepNext/>
+        <w:spacing w:before="200"/>
+      </w:pPr>
+      <w:r>
+        <w:rPr>
+          <w:b/>
+          <w:color w:val="1F4E79"/>
+        </w:rPr>
+        <w:t>#255 · 14:00 · Claude Code · sesión b3c0e64f</w:t>
+      </w:r>
+    </w:p>
+    <w:p>
+      <w:pPr>
+        <w:spacing w:after="40"/>
+        <w:ind w:left="227"/>
+      </w:pPr>
+      <w:r>
+        <w:t>ok</w:t>
+      </w:r>
+    </w:p>
+    <w:p>
+      <w:pPr>
+        <w:keepNext/>
+        <w:spacing w:before="200"/>
+      </w:pPr>
+      <w:r>
+        <w:rPr>
+          <w:b/>
+          <w:color w:val="1F4E79"/>
+        </w:rPr>
+        <w:t>#256 · 17:44 · Claude Code · sesión b3c0e64f</w:t>
+      </w:r>
+    </w:p>
+    <w:p>
+      <w:pPr>
+        <w:spacing w:after="40"/>
+        <w:ind w:left="227"/>
+      </w:pPr>
+      <w:r>
+        <w:t>abre una ventana del ipad y te accedo a github</w:t>
+      </w:r>
+    </w:p>
+    <w:p>
+      <w:pPr>
+        <w:keepNext/>
+        <w:spacing w:before="200"/>
+      </w:pPr>
+      <w:r>
+        <w:rPr>
+          <w:b/>
+          <w:color w:val="1F4E79"/>
+        </w:rPr>
+        <w:t>#257 · 17:46 · Claude Code · sesión b3c0e64f</w:t>
+      </w:r>
+    </w:p>
+    <w:p>
+      <w:pPr>
+        <w:spacing w:after="40"/>
+        <w:ind w:left="227"/>
+      </w:pPr>
+      <w:r>
+        <w:t>estas dentro</w:t>
+      </w:r>
+    </w:p>
+    <w:p>
+      <w:pPr>
+        <w:keepNext/>
+        <w:spacing w:before="200"/>
+      </w:pPr>
+      <w:r>
+        <w:rPr>
+          <w:b/>
+          <w:color w:val="1F4E79"/>
+        </w:rPr>
+        <w:t>#258 · 17:49 · Claude Code · sesión b3c0e64f</w:t>
+      </w:r>
+    </w:p>
+    <w:p>
+      <w:pPr>
+        <w:spacing w:after="40"/>
+        <w:ind w:left="227"/>
+      </w:pPr>
+      <w:r>
+        <w:t>si, cambia el enlace y haz el montaje</w:t>
+      </w:r>
+    </w:p>
+    <w:p>
+      <w:pPr>
+        <w:keepNext/>
+        <w:spacing w:before="200"/>
+      </w:pPr>
+      <w:r>
+        <w:rPr>
+          <w:b/>
+          <w:color w:val="1F4E79"/>
+        </w:rPr>
+        <w:t>#259 · 17:50 · Claude Code · sesión b3c0e64f</w:t>
+      </w:r>
+    </w:p>
+    <w:p>
+      <w:pPr>
+        <w:spacing w:after="40"/>
+        <w:ind w:left="227"/>
+      </w:pPr>
+      <w:r>
+        <w:t>vuelve a grabar la toma 10 con el link correcto</w:t>
+      </w:r>
+    </w:p>
+    <w:p>
+      <w:pPr>
+        <w:keepNext/>
+        <w:spacing w:before="200"/>
+      </w:pPr>
+      <w:r>
+        <w:rPr>
+          <w:b/>
+          <w:color w:val="1F4E79"/>
+        </w:rPr>
+        <w:t>#260 · 18:07 · Claude Code · sesión b3c0e64f</w:t>
+      </w:r>
+    </w:p>
+    <w:p>
+      <w:pPr>
+        <w:spacing w:after="40"/>
+        <w:ind w:left="227"/>
+      </w:pPr>
+      <w:r>
+        <w:t>Vamos a solucionar esto del repositorio. En deployments. Me guías paso a paso. Pero antes, ya que estoy en GitHub, eh, estoy en la ventana de settings. Para dar acceso a colaboradores al email de, de automatizaciones o algo así, era el concurso. Me lo puedes recordar, por favor.</w:t>
+      </w:r>
+    </w:p>
+    <w:p>
+      <w:pPr>
+        <w:keepNext/>
+        <w:spacing w:before="200"/>
+      </w:pPr>
+      <w:r>
+        <w:rPr>
+          <w:b/>
+          <w:color w:val="1F4E79"/>
+        </w:rPr>
+        <w:t>#261 · 18:07 · Claude Code · sesión b3c0e64f</w:t>
+      </w:r>
+    </w:p>
+    <w:p>
+      <w:pPr>
+        <w:spacing w:after="40"/>
+        <w:ind w:left="227"/>
+      </w:pPr>
+      <w:r>
+        <w:t>correcto¿?</w:t>
+      </w:r>
+    </w:p>
+    <w:p>
+      <w:pPr>
+        <w:keepNext/>
+        <w:spacing w:before="200"/>
+      </w:pPr>
+      <w:r>
+        <w:rPr>
+          <w:b/>
+          <w:color w:val="1F4E79"/>
+        </w:rPr>
+        <w:t>#262 · 18:09 · Claude Code · sesión b3c0e64f</w:t>
+      </w:r>
+    </w:p>
+    <w:p>
+      <w:pPr>
+        <w:spacing w:after="40"/>
+        <w:ind w:left="227"/>
+      </w:pPr>
+      <w:r>
+        <w:t>hecho, ya está desconectado de Vercel</w:t>
+      </w:r>
+    </w:p>
+    <w:p>
+      <w:pPr>
+        <w:keepNext/>
+        <w:spacing w:before="200"/>
+      </w:pPr>
+      <w:r>
+        <w:rPr>
+          <w:b/>
+          <w:color w:val="1F4E79"/>
+        </w:rPr>
+        <w:t>#263 · 18:19 · Claude Code · sesión b3c0e64f</w:t>
+      </w:r>
+    </w:p>
+    <w:p>
+      <w:pPr>
+        <w:spacing w:after="40"/>
+        <w:ind w:left="227"/>
+      </w:pPr>
+      <w:r>
+        <w:t>hecho, cierra la sesión de GitHub del iPad</w:t>
+      </w:r>
+    </w:p>
+    <w:p>
+      <w:pPr>
+        <w:keepNext/>
+        <w:spacing w:before="200"/>
+      </w:pPr>
+      <w:r>
+        <w:rPr>
+          <w:b/>
+          <w:color w:val="1F4E79"/>
+        </w:rPr>
+        <w:t>#264 · 18:20 · Claude Code · sesión b3c0e64f</w:t>
+      </w:r>
+    </w:p>
+    <w:p>
+      <w:pPr>
+        <w:spacing w:after="40"/>
+        <w:ind w:left="227"/>
+      </w:pPr>
+      <w:r>
+        <w:t>Vale, por último, no te lo he dicho, se me acaba de ocurrir ahora, de que subtitules el vídeo. Aparte de que la Mónica vaya hablando, subtitular el vídeo en español con letra blanca y reborde en negro, ¿vale? Para que contraste. Tampoco que sea enorme ni pequeña en la parte inferior, pero que, que vaya escribiendo lo que habla Mónica porque a veces no hay volumen y, y la gente prefiere leer que escuchar.</w:t>
+      </w:r>
+    </w:p>
+    <w:p>
+      <w:pPr>
+        <w:keepNext/>
+        <w:spacing w:before="200"/>
+      </w:pPr>
+      <w:r>
+        <w:rPr>
+          <w:b/>
+          <w:color w:val="1F4E79"/>
+        </w:rPr>
+        <w:t>#265 · 18:24 · Claude Code · sesión b3c0e64f</w:t>
+      </w:r>
+    </w:p>
+    <w:p>
+      <w:pPr>
+        <w:spacing w:after="40"/>
+        <w:ind w:left="227"/>
+      </w:pPr>
+      <w:r>
+        <w:t>Bien, buen trabajo, buena iniciativa. Voy a hacer una prueba real de que funciona bien y cuando vuelva revisamos el vídeo y si está todo ok, pues le damos carpetazo al proyecto.</w:t>
+      </w:r>
+    </w:p>
+    <w:p>
+      <w:pPr>
+        <w:keepNext/>
+        <w:spacing w:before="200"/>
+      </w:pPr>
+      <w:r>
+        <w:rPr>
+          <w:b/>
+          <w:color w:val="1F4E79"/>
+        </w:rPr>
+        <w:t>#266 · 20:54 · Claude Code · sesión b3c0e64f</w:t>
+      </w:r>
+    </w:p>
+    <w:p>
+      <w:pPr>
+        <w:spacing w:after="40"/>
+        <w:ind w:left="227"/>
+      </w:pPr>
+      <w:r>
+        <w:t>Vale, he hecho la prueba real, funciona perfecto, he hecho todos los pasos y seguramente te habrá quedado registrado el, el servicio. Eh, me gustaría que hiciéramos un pequeño documento eh, del paso a paso de cómo instalar las aplicaciones en el móvil, ¿vale? Y me, me compruebas que puedan instalar esas aplicaciones los jurados para que puedan comprobar el funcionamiento perfecto de la aplicación.</w:t>
+      </w:r>
+    </w:p>
+    <w:p>
+      <w:pPr>
+        <w:keepNext/>
+        <w:spacing w:before="200"/>
+      </w:pPr>
+      <w:r>
+        <w:rPr>
+          <w:b/>
+          <w:color w:val="1F4E79"/>
+        </w:rPr>
+        <w:t>#267 · 21:33 · Claude Code · sesión b3c0e64f</w:t>
+      </w:r>
+    </w:p>
+    <w:p>
+      <w:pPr>
+        <w:spacing w:after="40"/>
+        <w:ind w:left="227"/>
+      </w:pPr>
+      <w:r>
+        <w:t>desplegado en hostinger.</w:t>
+      </w:r>
+    </w:p>
+    <w:p>
+      <w:pPr>
+        <w:spacing w:after="40"/>
+        <w:ind w:left="227"/>
+      </w:pPr>
+      <w:r/>
+    </w:p>
+    <w:p>
+      <w:pPr>
+        <w:spacing w:after="40"/>
+        <w:ind w:left="227"/>
+      </w:pPr>
+      <w:r>
+        <w:t>1. En el móvil Android, abre en Chrome https://[dominio de la app]/android. Se descarga `TDL Conductor` (APK, unos 150 MB; mejor con wifi). Enlace directo, por si el corto no abre: https://expo.dev/artifacts/eas/sLajvHRbo399obLDSDlTB5zOJ-zBxFYt0m8varQodak.apk</w:t>
+      </w:r>
+    </w:p>
+    <w:p>
+      <w:pPr>
+        <w:spacing w:after="40"/>
+        <w:ind w:left="227"/>
+      </w:pPr>
+      <w:r/>
+    </w:p>
+    <w:p>
+      <w:pPr>
+        <w:spacing w:after="40"/>
+        <w:ind w:left="227"/>
+      </w:pPr>
+      <w:r>
+        <w:t>la segunda url descarga un apk, la primera 404</w:t>
+      </w:r>
+    </w:p>
+    <w:p>
+      <w:pPr>
+        <w:keepNext/>
+        <w:spacing w:before="200"/>
+      </w:pPr>
+      <w:r>
+        <w:rPr>
+          <w:b/>
+          <w:color w:val="1F4E79"/>
+        </w:rPr>
+        <w:t>#268 · 23:24 · Claude Code · sesión b3c0e64f</w:t>
+      </w:r>
+    </w:p>
+    <w:p>
+      <w:pPr>
+        <w:spacing w:after="40"/>
+        <w:ind w:left="227"/>
+      </w:pPr>
+      <w:r>
+        <w:t>ya funciona en incógnito</w:t>
+      </w:r>
+    </w:p>
+    <w:p>
+      <w:pPr>
+        <w:keepNext/>
+        <w:spacing w:before="200"/>
+      </w:pPr>
+      <w:r>
+        <w:rPr>
+          <w:b/>
+          <w:color w:val="1F4E79"/>
+        </w:rPr>
+        <w:t>#269 · 23:31 · Claude Code · sesión b3c0e64f</w:t>
+      </w:r>
+    </w:p>
+    <w:p>
+      <w:pPr>
+        <w:spacing w:after="40"/>
+        <w:ind w:left="227"/>
+      </w:pPr>
+      <w:r>
+        <w:t>descargada la, la aplicación y he entrado como conductor 3. Deberías de poner en las instrucciones que cuando lo descargas en, en un móvil, hay un momento en que te pide que fuerces la instalación porque no detecta la autenticidad del códice o algo así. Y Y deberías indicar que hay que instalar de todas formas.</w:t>
+      </w:r>
+    </w:p>
+    <w:p>
+      <w:r>
+        <w:br w:type="page"/>
+      </w:r>
+    </w:p>
+    <w:p>
+      <w:pPr>
+        <w:pStyle w:val="Heading1"/>
+      </w:pPr>
+      <w:r>
+        <w:t>Lunes 19 de octubre de 2026</w:t>
+      </w:r>
+    </w:p>
+    <w:p>
+      <w:pPr>
+        <w:keepNext/>
+        <w:spacing w:before="200"/>
+      </w:pPr>
+      <w:r>
+        <w:rPr>
+          <w:b/>
+          <w:color w:val="1F4E79"/>
+        </w:rPr>
+        <w:t>#270 · 10:27 · Claude Code · sesión b3c0e64f</w:t>
+      </w:r>
+    </w:p>
+    <w:p>
+      <w:pPr>
+        <w:spacing w:after="40"/>
+        <w:ind w:left="227"/>
+      </w:pPr>
+      <w:r>
+        <w:t>@"/Users/mac2019/Downloads/IMG_3488.mov"</w:t>
+      </w:r>
+    </w:p>
+    <w:p>
+      <w:pPr>
+        <w:spacing w:after="40"/>
+        <w:ind w:left="227"/>
+      </w:pPr>
+      <w:r>
+        <w:t>Te paso un vídeo que pondremos en el inicio de nuestro vídeo como presentación ¿vale? Quiero que hagas un montaje del fondo de los ordenadores y, encima, pones el muchacho que habla, que soy yo. ¿Vale? Eh, cuando termine el vídeo, haces un fundido y empiezas con el que ya tenemos preparado.</w:t>
+      </w:r>
+    </w:p>
+    <w:p>
+      <w:pPr>
+        <w:keepNext/>
+        <w:spacing w:before="200"/>
+      </w:pPr>
+      <w:r>
+        <w:rPr>
+          <w:b/>
+          <w:color w:val="1F4E79"/>
+        </w:rPr>
+        <w:t>#271 · 11:47 · Claude Code · sesión b3c0e64f</w:t>
+      </w:r>
+    </w:p>
+    <w:p>
+      <w:pPr>
+        <w:spacing w:after="40"/>
+        <w:ind w:left="227"/>
+      </w:pPr>
+      <w:r>
+        <w:t>Vale, brevemente me gustaría que introducieras una pequeña grabación de cuando el conductor se da de alta y hace un checking del coche y cuando se da de baja, pues si ha recibido algún algún, algún accidente, algún golpe, alguna rascada en el vehículo, lo puede marcar y eso queda, indicado en, en el panel de la central. ¿Vale? Ten en consideración del tiempo máximo de 5 minutos, que sea un vídeo breve y si no, haces una reducción o aceleración de los tiempos de pausa en todo el vídeo para que</w:t>
+      </w:r>
+    </w:p>
+    <w:p>
+      <w:pPr>
+        <w:keepNext/>
+        <w:spacing w:before="200"/>
+      </w:pPr>
+      <w:r>
+        <w:rPr>
+          <w:b/>
+          <w:color w:val="1F4E79"/>
+        </w:rPr>
+        <w:t>#272 · 12:04 · Claude Code · sesión b3c0e64f</w:t>
+      </w:r>
+    </w:p>
+    <w:p>
+      <w:pPr>
+        <w:spacing w:after="40"/>
+        <w:ind w:left="227"/>
+      </w:pPr>
+      <w:r>
+        <w:t>hagamos el repaso final para cerrar el proyecto</w:t>
       </w:r>
     </w:p>
     <w:sectPr>

</xml_diff>